<commit_message>
chore: checkpoint before SOM restructure
Stage current bizplan DOCX variants and CLAUDE.md SOT cleanup
before applying SOM = SAM × 10% restructure across SOT doc and bizplan.

Co-Authored-By: Claude Opus 4.6 (1M context) <noreply@anthropic.com>
</commit_message>
<xml_diff>
--- a/docs/예창패 실제 제풀용/claudecode/2026년 예비창업패키지 사업계획서_페르소닉AI.docx
+++ b/docs/예창패 실제 제풀용/claudecode/2026년 예비창업패키지 사업계획서_페르소닉AI.docx
@@ -589,6 +589,7 @@
                 <w:shd w:val="clear" w:color="auto" w:fill="auto"/>
               </w:rPr>
             </w:pPr>
+            <w:proofErr w:type="spellStart"/>
             <w:r>
               <w:rPr>
                 <w:rFonts w:ascii="맑은 고딕" w:hint="eastAsia"/>
@@ -598,6 +599,7 @@
               </w:rPr>
               <w:t>호랑랩스</w:t>
             </w:r>
+            <w:proofErr w:type="spellEnd"/>
           </w:p>
         </w:tc>
       </w:tr>
@@ -635,7 +637,27 @@
                 <w:sz w:val="22"/>
                 <w:shd w:val="clear" w:color="auto" w:fill="auto"/>
               </w:rPr>
-              <w:t xml:space="preserve">(예비)창업팀 구성 현황 </w:t>
+              <w:t>(예비)</w:t>
+            </w:r>
+            <w:proofErr w:type="spellStart"/>
+            <w:r>
+              <w:rPr>
+                <w:rFonts w:ascii="맑은 고딕" w:eastAsia="맑은 고딕"/>
+                <w:b/>
+                <w:sz w:val="22"/>
+                <w:shd w:val="clear" w:color="auto" w:fill="auto"/>
+              </w:rPr>
+              <w:t>창업팀</w:t>
+            </w:r>
+            <w:proofErr w:type="spellEnd"/>
+            <w:r>
+              <w:rPr>
+                <w:rFonts w:ascii="맑은 고딕" w:eastAsia="맑은 고딕"/>
+                <w:b/>
+                <w:sz w:val="22"/>
+                <w:shd w:val="clear" w:color="auto" w:fill="auto"/>
+              </w:rPr>
+              <w:t xml:space="preserve"> 구성 현황 </w:t>
             </w:r>
             <w:r>
               <w:rPr>
@@ -947,7 +969,6 @@
               <w:spacing w:line="240" w:lineRule="auto"/>
               <w:jc w:val="center"/>
               <w:rPr>
-                <w:rFonts w:hint="eastAsia"/>
                 <w:iCs/>
               </w:rPr>
             </w:pPr>
@@ -1123,7 +1144,23 @@
                 <w:rFonts w:asciiTheme="majorEastAsia" w:eastAsiaTheme="majorEastAsia" w:hAnsiTheme="majorEastAsia"/>
                 <w:iCs/>
               </w:rPr>
-              <w:t>프론트·백엔드 개발, 리포트 UI, 서비스 기능 구현</w:t>
+              <w:t>프론트·</w:t>
+            </w:r>
+            <w:proofErr w:type="spellStart"/>
+            <w:r>
+              <w:rPr>
+                <w:rFonts w:asciiTheme="majorEastAsia" w:eastAsiaTheme="majorEastAsia" w:hAnsiTheme="majorEastAsia"/>
+                <w:iCs/>
+              </w:rPr>
+              <w:t>백엔드</w:t>
+            </w:r>
+            <w:proofErr w:type="spellEnd"/>
+            <w:r>
+              <w:rPr>
+                <w:rFonts w:asciiTheme="majorEastAsia" w:eastAsiaTheme="majorEastAsia" w:hAnsiTheme="majorEastAsia"/>
+                <w:iCs/>
+              </w:rPr>
+              <w:t xml:space="preserve"> 개발, 리포트 UI, 서비스 기능 구현</w:t>
             </w:r>
           </w:p>
         </w:tc>
@@ -1153,7 +1190,23 @@
                 <w:rFonts w:asciiTheme="majorEastAsia" w:eastAsiaTheme="majorEastAsia" w:hAnsiTheme="majorEastAsia"/>
                 <w:iCs/>
               </w:rPr>
-              <w:t>웹 서비스 풀스택 개발 경력 5년</w:t>
+              <w:t xml:space="preserve">웹 서비스 </w:t>
+            </w:r>
+            <w:proofErr w:type="spellStart"/>
+            <w:r>
+              <w:rPr>
+                <w:rFonts w:asciiTheme="majorEastAsia" w:eastAsiaTheme="majorEastAsia" w:hAnsiTheme="majorEastAsia"/>
+                <w:iCs/>
+              </w:rPr>
+              <w:t>풀스택</w:t>
+            </w:r>
+            <w:proofErr w:type="spellEnd"/>
+            <w:r>
+              <w:rPr>
+                <w:rFonts w:asciiTheme="majorEastAsia" w:eastAsiaTheme="majorEastAsia" w:hAnsiTheme="majorEastAsia"/>
+                <w:iCs/>
+              </w:rPr>
+              <w:t xml:space="preserve"> 개발 경력 5년</w:t>
             </w:r>
           </w:p>
         </w:tc>
@@ -1771,6 +1824,7 @@
                 <w:szCs w:val="20"/>
               </w:rPr>
             </w:pPr>
+            <w:proofErr w:type="spellStart"/>
             <w:r>
               <w:rPr>
                 <w:rFonts w:ascii="함초롬바탕" w:eastAsia="함초롬바탕" w:hAnsi="Times New Roman" w:cs="Times New Roman" w:hint="eastAsia"/>
@@ -1780,6 +1834,7 @@
               </w:rPr>
               <w:t>페르소닉</w:t>
             </w:r>
+            <w:proofErr w:type="spellEnd"/>
             <w:r>
               <w:rPr>
                 <w:rFonts w:ascii="함초롬바탕" w:eastAsia="함초롬바탕" w:hAnsi="Times New Roman" w:cs="Times New Roman" w:hint="eastAsia"/>
@@ -1979,6 +2034,7 @@
                 <w:szCs w:val="20"/>
               </w:rPr>
             </w:pPr>
+            <w:proofErr w:type="spellStart"/>
             <w:r>
               <w:rPr>
                 <w:rFonts w:asciiTheme="minorEastAsia" w:eastAsiaTheme="minorEastAsia" w:hAnsiTheme="minorEastAsia" w:cs="Times New Roman" w:hint="eastAsia"/>
@@ -1987,6 +2043,7 @@
               </w:rPr>
               <w:t>페르소닉</w:t>
             </w:r>
+            <w:proofErr w:type="spellEnd"/>
             <w:r>
               <w:rPr>
                 <w:rFonts w:asciiTheme="minorEastAsia" w:eastAsiaTheme="minorEastAsia" w:hAnsiTheme="minorEastAsia" w:cs="Times New Roman"/>
@@ -2041,7 +2098,25 @@
                 <w:sz w:val="20"/>
                 <w:szCs w:val="20"/>
               </w:rPr>
-              <w:t xml:space="preserve">기존 AI의 긍정 편향을 줄이고 실제 사용자에 가까운 반응을 제공한다. 서비스는 합성 서베이, UI·UX 리뷰, 제품 체험의 3개 </w:t>
+              <w:t xml:space="preserve">기존 AI의 긍정 편향을 줄이고 실제 사용자에 가까운 반응을 제공한다. 서비스는 합성 </w:t>
+            </w:r>
+            <w:proofErr w:type="spellStart"/>
+            <w:r>
+              <w:rPr>
+                <w:rFonts w:asciiTheme="minorEastAsia" w:eastAsiaTheme="minorEastAsia" w:hAnsiTheme="minorEastAsia" w:cs="Times New Roman"/>
+                <w:sz w:val="20"/>
+                <w:szCs w:val="20"/>
+              </w:rPr>
+              <w:t>서베이</w:t>
+            </w:r>
+            <w:proofErr w:type="spellEnd"/>
+            <w:r>
+              <w:rPr>
+                <w:rFonts w:asciiTheme="minorEastAsia" w:eastAsiaTheme="minorEastAsia" w:hAnsiTheme="minorEastAsia" w:cs="Times New Roman"/>
+                <w:sz w:val="20"/>
+                <w:szCs w:val="20"/>
+              </w:rPr>
+              <w:t xml:space="preserve">, UI·UX 리뷰, 제품 체험의 3개 </w:t>
             </w:r>
             <w:r>
               <w:rPr>
@@ -2433,7 +2508,27 @@
                 <w:sz w:val="20"/>
                 <w:szCs w:val="20"/>
               </w:rPr>
-              <w:t xml:space="preserve"> 시장은 빠르게 성장 중이지만, 감정 재현과 실제 제품 사용을 함께 제공하는 서비스는 드물다. 페르소닉 AI는 국내 1인 개발자와 스타트업 PM을 대상으로 초기 고객을 확보한 뒤 글로벌 채널로 확장하고, 건별 과금 모델로 빠른 시장 진입과 매출 성장을 추진한다.</w:t>
+              <w:t xml:space="preserve"> 시장은 빠르게 성장 중이지만, 감정 재현과 실제 제품 사용을 함께 제공하는 서비스는 드물다. </w:t>
+            </w:r>
+            <w:proofErr w:type="spellStart"/>
+            <w:r>
+              <w:rPr>
+                <w:rFonts w:asciiTheme="minorEastAsia" w:eastAsiaTheme="minorEastAsia" w:hAnsiTheme="minorEastAsia" w:cs="Times New Roman"/>
+                <w:color w:val="000000"/>
+                <w:sz w:val="20"/>
+                <w:szCs w:val="20"/>
+              </w:rPr>
+              <w:t>페르소닉</w:t>
+            </w:r>
+            <w:proofErr w:type="spellEnd"/>
+            <w:r>
+              <w:rPr>
+                <w:rFonts w:asciiTheme="minorEastAsia" w:eastAsiaTheme="minorEastAsia" w:hAnsiTheme="minorEastAsia" w:cs="Times New Roman"/>
+                <w:color w:val="000000"/>
+                <w:sz w:val="20"/>
+                <w:szCs w:val="20"/>
+              </w:rPr>
+              <w:t xml:space="preserve"> AI는 국내 1인 개발자와 스타트업 PM을 대상으로 초기 고객을 확보한 뒤 글로벌 채널로 확장하고, 건별 과금 모델로 빠른 시장 진입과 매출 성장을 추진한다.</w:t>
             </w:r>
           </w:p>
         </w:tc>
@@ -2869,8 +2964,20 @@
                 <w:sz w:val="20"/>
                 <w:szCs w:val="20"/>
               </w:rPr>
-              <w:t>웹 서비스 프토토타입</w:t>
-            </w:r>
+              <w:t xml:space="preserve">웹 서비스 </w:t>
+            </w:r>
+            <w:proofErr w:type="spellStart"/>
+            <w:r>
+              <w:rPr>
+                <w:rFonts w:ascii="HY헤드라인M" w:eastAsia="HY헤드라인M" w:hAnsi="Times New Roman" w:cs="Times New Roman" w:hint="eastAsia"/>
+                <w:b/>
+                <w:color w:val="000000"/>
+                <w:sz w:val="20"/>
+                <w:szCs w:val="20"/>
+              </w:rPr>
+              <w:t>프토토타입</w:t>
+            </w:r>
+            <w:proofErr w:type="spellEnd"/>
           </w:p>
         </w:tc>
         <w:tc>
@@ -3451,6 +3558,7 @@
                 <w:rFonts w:asciiTheme="minorEastAsia" w:eastAsiaTheme="minorEastAsia" w:hAnsiTheme="minorEastAsia"/>
               </w:rPr>
             </w:pPr>
+            <w:proofErr w:type="spellStart"/>
             <w:r>
               <w:rPr>
                 <w:rFonts w:asciiTheme="minorEastAsia" w:eastAsiaTheme="minorEastAsia" w:hAnsiTheme="minorEastAsia" w:hint="eastAsia"/>
@@ -3469,6 +3577,7 @@
               </w:rPr>
               <w:t>시간</w:t>
             </w:r>
+            <w:proofErr w:type="spellEnd"/>
           </w:p>
         </w:tc>
       </w:tr>
@@ -3661,11 +3770,19 @@
               </w:rPr>
               <w:t>”</w:t>
             </w:r>
-            <w:r>
-              <w:rPr>
-                <w:rFonts w:asciiTheme="minorEastAsia" w:eastAsiaTheme="minorEastAsia" w:hAnsiTheme="minorEastAsia" w:hint="eastAsia"/>
-              </w:rPr>
-              <w:t>를 모름, 출시 후에만 가능</w:t>
+            <w:proofErr w:type="spellStart"/>
+            <w:r>
+              <w:rPr>
+                <w:rFonts w:asciiTheme="minorEastAsia" w:eastAsiaTheme="minorEastAsia" w:hAnsiTheme="minorEastAsia" w:hint="eastAsia"/>
+              </w:rPr>
+              <w:t>를</w:t>
+            </w:r>
+            <w:proofErr w:type="spellEnd"/>
+            <w:r>
+              <w:rPr>
+                <w:rFonts w:asciiTheme="minorEastAsia" w:eastAsiaTheme="minorEastAsia" w:hAnsiTheme="minorEastAsia" w:hint="eastAsia"/>
+              </w:rPr>
+              <w:t xml:space="preserve"> 모름, 출시 후에만 가능</w:t>
             </w:r>
           </w:p>
         </w:tc>
@@ -3873,7 +3990,35 @@
         <w:rPr>
           <w:rFonts w:asciiTheme="minorEastAsia" w:eastAsiaTheme="minorEastAsia" w:hAnsiTheme="minorEastAsia"/>
         </w:rPr>
-        <w:t>이상의 투자가 집중되고 있다. 리서처의 48%가 "합성 유저"를 2026년 최대 트렌드로 선택하였고(Maze, 2026), 합성 응답을 사용한 기업의 87%가 높은 만족도를 보고하는 등(Qualtrics, 2024) 시장이 본격적으로 열리고 있다. 그러나 현재의 AI 합성 페르소</w:t>
+        <w:t xml:space="preserve">이상의 투자가 집중되고 있다. </w:t>
+      </w:r>
+      <w:proofErr w:type="spellStart"/>
+      <w:r>
+        <w:rPr>
+          <w:rFonts w:asciiTheme="minorEastAsia" w:eastAsiaTheme="minorEastAsia" w:hAnsiTheme="minorEastAsia"/>
+        </w:rPr>
+        <w:t>리서처의</w:t>
+      </w:r>
+      <w:proofErr w:type="spellEnd"/>
+      <w:r>
+        <w:rPr>
+          <w:rFonts w:asciiTheme="minorEastAsia" w:eastAsiaTheme="minorEastAsia" w:hAnsiTheme="minorEastAsia"/>
+        </w:rPr>
+        <w:t xml:space="preserve"> 48%가 "합성 유저"</w:t>
+      </w:r>
+      <w:proofErr w:type="spellStart"/>
+      <w:r>
+        <w:rPr>
+          <w:rFonts w:asciiTheme="minorEastAsia" w:eastAsiaTheme="minorEastAsia" w:hAnsiTheme="minorEastAsia"/>
+        </w:rPr>
+        <w:t>를</w:t>
+      </w:r>
+      <w:proofErr w:type="spellEnd"/>
+      <w:r>
+        <w:rPr>
+          <w:rFonts w:asciiTheme="minorEastAsia" w:eastAsiaTheme="minorEastAsia" w:hAnsiTheme="minorEastAsia"/>
+        </w:rPr>
+        <w:t xml:space="preserve"> 2026년 최대 트렌드로 선택하였고(Maze, 2026), 합성 응답을 사용한 기업의 87%가 높은 만족도를 보고하는 등(Qualtrics, 2024) 시장이 본격적으로 열리고 있다. 그러나 현재의 AI 합성 페르소</w:t>
       </w:r>
       <w:r>
         <w:rPr>
@@ -3998,7 +4143,35 @@
               <w:rPr>
                 <w:rFonts w:asciiTheme="minorEastAsia" w:eastAsiaTheme="minorEastAsia" w:hAnsiTheme="minorEastAsia"/>
               </w:rPr>
-              <w:t>AI 모델의 58%가 아부적 행동을 보이며, 불만을 느낄 상황에서도 "좋다"고 답한다 (TechPolicy.Press, 2025)</w:t>
+              <w:t xml:space="preserve">AI 모델의 58%가 </w:t>
+            </w:r>
+            <w:proofErr w:type="spellStart"/>
+            <w:r>
+              <w:rPr>
+                <w:rFonts w:asciiTheme="minorEastAsia" w:eastAsiaTheme="minorEastAsia" w:hAnsiTheme="minorEastAsia"/>
+              </w:rPr>
+              <w:t>아부적</w:t>
+            </w:r>
+            <w:proofErr w:type="spellEnd"/>
+            <w:r>
+              <w:rPr>
+                <w:rFonts w:asciiTheme="minorEastAsia" w:eastAsiaTheme="minorEastAsia" w:hAnsiTheme="minorEastAsia"/>
+              </w:rPr>
+              <w:t xml:space="preserve"> 행동을 보이며, 불만을 느낄 상황에서도 "좋다"고 답한다 (</w:t>
+            </w:r>
+            <w:proofErr w:type="spellStart"/>
+            <w:r>
+              <w:rPr>
+                <w:rFonts w:asciiTheme="minorEastAsia" w:eastAsiaTheme="minorEastAsia" w:hAnsiTheme="minorEastAsia"/>
+              </w:rPr>
+              <w:t>TechPolicy.Press</w:t>
+            </w:r>
+            <w:proofErr w:type="spellEnd"/>
+            <w:r>
+              <w:rPr>
+                <w:rFonts w:asciiTheme="minorEastAsia" w:eastAsiaTheme="minorEastAsia" w:hAnsiTheme="minorEastAsia"/>
+              </w:rPr>
+              <w:t>, 2025)</w:t>
             </w:r>
           </w:p>
         </w:tc>
@@ -4264,12 +4437,20 @@
         </w:rPr>
         <w:t xml:space="preserve">규모이며, 이 중 리서치 소프트웨어 영역은 연 11.5%로 성장하고 있다 (ESOMAR, 2025). </w:t>
       </w:r>
+      <w:proofErr w:type="spellStart"/>
       <w:r>
         <w:rPr>
           <w:rFonts w:asciiTheme="minorEastAsia" w:eastAsiaTheme="minorEastAsia" w:hAnsiTheme="minorEastAsia" w:hint="eastAsia"/>
         </w:rPr>
         <w:lastRenderedPageBreak/>
-        <w:t>페르소닉 AI</w:t>
+        <w:t>페르소닉</w:t>
+      </w:r>
+      <w:proofErr w:type="spellEnd"/>
+      <w:r>
+        <w:rPr>
+          <w:rFonts w:asciiTheme="minorEastAsia" w:eastAsiaTheme="minorEastAsia" w:hAnsiTheme="minorEastAsia" w:hint="eastAsia"/>
+        </w:rPr>
+        <w:t xml:space="preserve"> AI</w:t>
       </w:r>
       <w:r>
         <w:rPr>
@@ -4677,12 +4858,14 @@
           <w:rFonts w:asciiTheme="minorEastAsia" w:eastAsiaTheme="minorEastAsia" w:hAnsiTheme="minorEastAsia"/>
         </w:rPr>
       </w:pPr>
+      <w:proofErr w:type="spellStart"/>
       <w:r>
         <w:rPr>
           <w:rFonts w:asciiTheme="minorEastAsia" w:eastAsiaTheme="minorEastAsia" w:hAnsiTheme="minorEastAsia" w:hint="eastAsia"/>
         </w:rPr>
         <w:t>리서처</w:t>
       </w:r>
+      <w:proofErr w:type="spellEnd"/>
       <w:r>
         <w:rPr>
           <w:rFonts w:asciiTheme="minorEastAsia" w:eastAsiaTheme="minorEastAsia" w:hAnsiTheme="minorEastAsia"/>
@@ -4734,11 +4917,19 @@
           <w:rFonts w:asciiTheme="minorEastAsia" w:eastAsiaTheme="minorEastAsia" w:hAnsiTheme="minorEastAsia"/>
         </w:rPr>
       </w:pPr>
+      <w:proofErr w:type="spellStart"/>
       <w:r>
         <w:rPr>
           <w:rFonts w:asciiTheme="minorEastAsia" w:eastAsiaTheme="minorEastAsia" w:hAnsiTheme="minorEastAsia" w:hint="eastAsia"/>
         </w:rPr>
-        <w:t>페르소닉 AI</w:t>
+        <w:t>페르소닉</w:t>
+      </w:r>
+      <w:proofErr w:type="spellEnd"/>
+      <w:r>
+        <w:rPr>
+          <w:rFonts w:asciiTheme="minorEastAsia" w:eastAsiaTheme="minorEastAsia" w:hAnsiTheme="minorEastAsia" w:hint="eastAsia"/>
+        </w:rPr>
+        <w:t xml:space="preserve"> AI</w:t>
       </w:r>
       <w:r>
         <w:rPr>
@@ -4831,11 +5022,19 @@
                 <w:rFonts w:asciiTheme="minorEastAsia" w:eastAsiaTheme="minorEastAsia" w:hAnsiTheme="minorEastAsia"/>
               </w:rPr>
             </w:pPr>
-            <w:r>
-              <w:rPr>
-                <w:rFonts w:asciiTheme="minorEastAsia" w:eastAsiaTheme="minorEastAsia" w:hAnsiTheme="minorEastAsia" w:hint="eastAsia"/>
-              </w:rPr>
-              <w:t>페르소닉 AI의 해결</w:t>
+            <w:proofErr w:type="spellStart"/>
+            <w:r>
+              <w:rPr>
+                <w:rFonts w:asciiTheme="minorEastAsia" w:eastAsiaTheme="minorEastAsia" w:hAnsiTheme="minorEastAsia" w:hint="eastAsia"/>
+              </w:rPr>
+              <w:t>페르소닉</w:t>
+            </w:r>
+            <w:proofErr w:type="spellEnd"/>
+            <w:r>
+              <w:rPr>
+                <w:rFonts w:asciiTheme="minorEastAsia" w:eastAsiaTheme="minorEastAsia" w:hAnsiTheme="minorEastAsia" w:hint="eastAsia"/>
+              </w:rPr>
+              <w:t xml:space="preserve"> AI의 해결</w:t>
             </w:r>
           </w:p>
         </w:tc>
@@ -5544,6 +5743,7 @@
         </w:rPr>
         <w:t xml:space="preserve">최종 산출물은 </w:t>
       </w:r>
+      <w:proofErr w:type="spellStart"/>
       <w:r>
         <w:rPr>
           <w:rFonts w:asciiTheme="minorEastAsia" w:eastAsiaTheme="minorEastAsia" w:hAnsiTheme="minorEastAsia" w:hint="eastAsia"/>
@@ -5556,6 +5756,7 @@
         </w:rPr>
         <w:t>닉</w:t>
       </w:r>
+      <w:proofErr w:type="spellEnd"/>
       <w:r>
         <w:rPr>
           <w:rFonts w:asciiTheme="minorEastAsia" w:eastAsiaTheme="minorEastAsia" w:hAnsiTheme="minorEastAsia" w:hint="eastAsia"/>
@@ -5566,7 +5767,21 @@
         <w:rPr>
           <w:rFonts w:asciiTheme="minorEastAsia" w:eastAsiaTheme="minorEastAsia" w:hAnsiTheme="minorEastAsia"/>
         </w:rPr>
-        <w:t xml:space="preserve">웹서비스 1개이며, 입력 방식에 따라 합성 서베이·UI/UX 리뷰·제품 체험 3개 </w:t>
+        <w:t xml:space="preserve">웹서비스 1개이며, 입력 방식에 따라 합성 </w:t>
+      </w:r>
+      <w:proofErr w:type="spellStart"/>
+      <w:r>
+        <w:rPr>
+          <w:rFonts w:asciiTheme="minorEastAsia" w:eastAsiaTheme="minorEastAsia" w:hAnsiTheme="minorEastAsia"/>
+        </w:rPr>
+        <w:t>서베이</w:t>
+      </w:r>
+      <w:proofErr w:type="spellEnd"/>
+      <w:r>
+        <w:rPr>
+          <w:rFonts w:asciiTheme="minorEastAsia" w:eastAsiaTheme="minorEastAsia" w:hAnsiTheme="minorEastAsia"/>
+        </w:rPr>
+        <w:t xml:space="preserve">·UI/UX 리뷰·제품 체험 3개 </w:t>
       </w:r>
       <w:r>
         <w:rPr>
@@ -5602,7 +5817,21 @@
         <w:rPr>
           <w:rFonts w:asciiTheme="minorEastAsia" w:eastAsiaTheme="minorEastAsia" w:hAnsiTheme="minorEastAsia"/>
         </w:rPr>
-        <w:t>별 시뮬레이션을 실행한 뒤, 세그먼트별 교차 분석 리포트를 자동 생성한다. 합성 서베이는 수 분, 제품 체험(30명 기준)은 약 40분이 소요되며, 기존 리서치(2-4주)와 비교하면 크게 단축된다.</w:t>
+        <w:t xml:space="preserve">별 시뮬레이션을 실행한 뒤, 세그먼트별 교차 분석 리포트를 자동 생성한다. 합성 </w:t>
+      </w:r>
+      <w:proofErr w:type="spellStart"/>
+      <w:r>
+        <w:rPr>
+          <w:rFonts w:asciiTheme="minorEastAsia" w:eastAsiaTheme="minorEastAsia" w:hAnsiTheme="minorEastAsia"/>
+        </w:rPr>
+        <w:t>서베이는</w:t>
+      </w:r>
+      <w:proofErr w:type="spellEnd"/>
+      <w:r>
+        <w:rPr>
+          <w:rFonts w:asciiTheme="minorEastAsia" w:eastAsiaTheme="minorEastAsia" w:hAnsiTheme="minorEastAsia"/>
+        </w:rPr>
+        <w:t xml:space="preserve"> 수 분, 제품 체험(30명 기준)은 약 40분이 소요되며, 기존 리서치(2-4주)와 비교하면 크게 단축된다.</w:t>
       </w:r>
     </w:p>
     <w:tbl>
@@ -5705,8 +5934,16 @@
               <w:rPr>
                 <w:rFonts w:asciiTheme="minorEastAsia" w:eastAsiaTheme="minorEastAsia" w:hAnsiTheme="minorEastAsia" w:hint="eastAsia"/>
               </w:rPr>
-              <w:t>합성 서베이</w:t>
-            </w:r>
+              <w:t xml:space="preserve">합성 </w:t>
+            </w:r>
+            <w:proofErr w:type="spellStart"/>
+            <w:r>
+              <w:rPr>
+                <w:rFonts w:asciiTheme="minorEastAsia" w:eastAsiaTheme="minorEastAsia" w:hAnsiTheme="minorEastAsia" w:hint="eastAsia"/>
+              </w:rPr>
+              <w:t>서베이</w:t>
+            </w:r>
+            <w:proofErr w:type="spellEnd"/>
           </w:p>
         </w:tc>
         <w:tc>
@@ -6013,12 +6250,21 @@
         </w:rPr>
         <w:t xml:space="preserve"> AI 합성 페르소나가 "다 좋다"고 답하는 이유는 감정 판단을 AI(LLM) 스스로에게 맡기기 때문이다. </w:t>
       </w:r>
+      <w:proofErr w:type="spellStart"/>
       <w:r>
         <w:rPr>
           <w:rFonts w:asciiTheme="minorEastAsia" w:eastAsiaTheme="minorEastAsia" w:hAnsiTheme="minorEastAsia" w:hint="eastAsia"/>
           <w:bCs/>
         </w:rPr>
-        <w:t>페르소닉 AI</w:t>
+        <w:t>페르소닉</w:t>
+      </w:r>
+      <w:proofErr w:type="spellEnd"/>
+      <w:r>
+        <w:rPr>
+          <w:rFonts w:asciiTheme="minorEastAsia" w:eastAsiaTheme="minorEastAsia" w:hAnsiTheme="minorEastAsia" w:hint="eastAsia"/>
+          <w:bCs/>
+        </w:rPr>
+        <w:t xml:space="preserve"> AI</w:t>
       </w:r>
       <w:r>
         <w:rPr>
@@ -6386,8 +6632,16 @@
               <w:rPr>
                 <w:rFonts w:asciiTheme="minorEastAsia" w:eastAsiaTheme="minorEastAsia" w:hAnsiTheme="minorEastAsia"/>
               </w:rPr>
-              <w:t>좌절감 높음 → 뒤로가기</w:t>
-            </w:r>
+              <w:t xml:space="preserve">좌절감 높음 → </w:t>
+            </w:r>
+            <w:proofErr w:type="spellStart"/>
+            <w:r>
+              <w:rPr>
+                <w:rFonts w:asciiTheme="minorEastAsia" w:eastAsiaTheme="minorEastAsia" w:hAnsiTheme="minorEastAsia"/>
+              </w:rPr>
+              <w:t>뒤로가기</w:t>
+            </w:r>
+            <w:proofErr w:type="spellEnd"/>
           </w:p>
         </w:tc>
       </w:tr>
@@ -7103,7 +7357,23 @@
           <w:rFonts w:asciiTheme="minorEastAsia" w:eastAsiaTheme="minorEastAsia" w:hAnsiTheme="minorEastAsia"/>
           <w:bCs/>
         </w:rPr>
-        <w:t>1장에서 분석한 세 가지 한계(긍정 편향·제품 미사용·분화 부족)에 대해, 일부 경쟁사가 감정 요소 도입(Synthetic Users)이나 제품 데이터 연동(Blok)을 시도하고 있지만, 세 가지를 동시에 해결하는 상용 서비스는 아직 없다. 학술적으로는 Amazon UXAgent(CHI 2025)와 Stanford Generative Agents(2023)가 방향을 검증하였으나, 이를 완전한 상용 서비스로 구현한 곳은 현재 없다</w:t>
+        <w:t xml:space="preserve">1장에서 분석한 세 가지 한계(긍정 편향·제품 미사용·분화 부족)에 대해, 일부 경쟁사가 감정 요소 도입(Synthetic Users)이나 제품 데이터 연동(Blok)을 시도하고 있지만, 세 가지를 동시에 해결하는 상용 서비스는 아직 없다. 학술적으로는 Amazon </w:t>
+      </w:r>
+      <w:proofErr w:type="spellStart"/>
+      <w:r>
+        <w:rPr>
+          <w:rFonts w:asciiTheme="minorEastAsia" w:eastAsiaTheme="minorEastAsia" w:hAnsiTheme="minorEastAsia"/>
+          <w:bCs/>
+        </w:rPr>
+        <w:t>UXAgent</w:t>
+      </w:r>
+      <w:proofErr w:type="spellEnd"/>
+      <w:r>
+        <w:rPr>
+          <w:rFonts w:asciiTheme="minorEastAsia" w:eastAsiaTheme="minorEastAsia" w:hAnsiTheme="minorEastAsia"/>
+          <w:bCs/>
+        </w:rPr>
+        <w:t>(CHI 2025)와 Stanford Generative Agents(2023)가 방향을 검증하였으나, 이를 완전한 상용 서비스로 구현한 곳은 현재 없다</w:t>
       </w:r>
       <w:r>
         <w:rPr>
@@ -7420,7 +7690,7 @@
               <w:ind w:left="238" w:right="227"/>
               <w:jc w:val="center"/>
               <w:rPr>
-                <w:rFonts w:asciiTheme="minorEastAsia" w:eastAsiaTheme="minorEastAsia" w:hAnsiTheme="minorEastAsia"/>
+                <w:rFonts w:asciiTheme="minorEastAsia" w:eastAsiaTheme="minorEastAsia" w:hAnsiTheme="minorEastAsia" w:hint="eastAsia"/>
                 <w:iCs/>
               </w:rPr>
             </w:pPr>
@@ -7430,6 +7700,13 @@
                 <w:iCs/>
               </w:rPr>
               <w:t>필수 개발 인력 채용</w:t>
+            </w:r>
+            <w:r>
+              <w:rPr>
+                <w:rFonts w:asciiTheme="minorEastAsia" w:eastAsiaTheme="minorEastAsia" w:hAnsiTheme="minorEastAsia" w:hint="eastAsia"/>
+                <w:iCs/>
+              </w:rPr>
+              <w:t xml:space="preserve"> 및 제품 설계</w:t>
             </w:r>
           </w:p>
         </w:tc>
@@ -7495,7 +7772,7 @@
               <w:ind w:left="290" w:right="270"/>
               <w:jc w:val="center"/>
               <w:rPr>
-                <w:rFonts w:asciiTheme="minorEastAsia" w:eastAsiaTheme="minorEastAsia" w:hAnsiTheme="minorEastAsia"/>
+                <w:rFonts w:asciiTheme="minorEastAsia" w:eastAsiaTheme="minorEastAsia" w:hAnsiTheme="minorEastAsia" w:hint="eastAsia"/>
                 <w:iCs/>
               </w:rPr>
             </w:pPr>
@@ -7526,6 +7803,13 @@
                 <w:iCs/>
               </w:rPr>
               <w:t>(파트타임)</w:t>
+            </w:r>
+            <w:r>
+              <w:rPr>
+                <w:rFonts w:asciiTheme="minorEastAsia" w:eastAsiaTheme="minorEastAsia" w:hAnsiTheme="minorEastAsia" w:hint="eastAsia"/>
+                <w:iCs/>
+              </w:rPr>
+              <w:t>, 우선 개발 범위 확정</w:t>
             </w:r>
           </w:p>
         </w:tc>
@@ -7578,7 +7862,7 @@
                 <w:rFonts w:asciiTheme="minorEastAsia" w:eastAsiaTheme="minorEastAsia" w:hAnsiTheme="minorEastAsia" w:hint="eastAsia"/>
                 <w:iCs/>
               </w:rPr>
-              <w:t>서비스 개발</w:t>
+              <w:t>핵심 엔진 고도화</w:t>
             </w:r>
           </w:p>
         </w:tc>
@@ -7593,16 +7877,23 @@
               <w:ind w:left="536" w:right="522"/>
               <w:jc w:val="center"/>
               <w:rPr>
-                <w:rFonts w:asciiTheme="minorEastAsia" w:eastAsiaTheme="minorEastAsia" w:hAnsiTheme="minorEastAsia"/>
-                <w:iCs/>
-              </w:rPr>
-            </w:pPr>
-            <w:r>
-              <w:rPr>
-                <w:rFonts w:asciiTheme="minorEastAsia" w:eastAsiaTheme="minorEastAsia" w:hAnsiTheme="minorEastAsia"/>
-                <w:iCs/>
-              </w:rPr>
-              <w:t>26.06-26.09</w:t>
+                <w:rFonts w:asciiTheme="minorEastAsia" w:eastAsiaTheme="minorEastAsia" w:hAnsiTheme="minorEastAsia" w:hint="eastAsia"/>
+                <w:iCs/>
+              </w:rPr>
+            </w:pPr>
+            <w:r>
+              <w:rPr>
+                <w:rFonts w:asciiTheme="minorEastAsia" w:eastAsiaTheme="minorEastAsia" w:hAnsiTheme="minorEastAsia"/>
+                <w:iCs/>
+              </w:rPr>
+              <w:t>26.06-26.0</w:t>
+            </w:r>
+            <w:r>
+              <w:rPr>
+                <w:rFonts w:asciiTheme="minorEastAsia" w:eastAsiaTheme="minorEastAsia" w:hAnsiTheme="minorEastAsia" w:hint="eastAsia"/>
+                <w:iCs/>
+              </w:rPr>
+              <w:t>8</w:t>
             </w:r>
           </w:p>
         </w:tc>
@@ -7617,16 +7908,16 @@
               <w:ind w:left="290" w:right="272"/>
               <w:jc w:val="center"/>
               <w:rPr>
-                <w:rFonts w:asciiTheme="minorEastAsia" w:eastAsiaTheme="minorEastAsia" w:hAnsiTheme="minorEastAsia"/>
-                <w:iCs/>
-              </w:rPr>
-            </w:pPr>
-            <w:r>
-              <w:rPr>
-                <w:rFonts w:asciiTheme="minorEastAsia" w:eastAsiaTheme="minorEastAsia" w:hAnsiTheme="minorEastAsia"/>
-                <w:iCs/>
-              </w:rPr>
-              <w:t>엔진 고도화, 웹 서비스 및 리포트 UI 구축</w:t>
+                <w:rFonts w:asciiTheme="minorEastAsia" w:eastAsiaTheme="minorEastAsia" w:hAnsiTheme="minorEastAsia" w:hint="eastAsia"/>
+                <w:iCs/>
+              </w:rPr>
+            </w:pPr>
+            <w:r>
+              <w:rPr>
+                <w:rFonts w:asciiTheme="minorEastAsia" w:eastAsiaTheme="minorEastAsia" w:hAnsiTheme="minorEastAsia" w:hint="eastAsia"/>
+                <w:iCs/>
+              </w:rPr>
+              <w:t>성격 기반 분화, 감정 재현, 행동 결정 로직 서비스형으로 고도화</w:t>
             </w:r>
           </w:p>
         </w:tc>
@@ -7667,14 +7958,22 @@
             <w:pPr>
               <w:jc w:val="center"/>
               <w:rPr>
-                <w:rFonts w:asciiTheme="minorEastAsia" w:eastAsiaTheme="minorEastAsia" w:hAnsiTheme="minorEastAsia" w:cs="Segoe UI"/>
-              </w:rPr>
-            </w:pPr>
-            <w:r>
-              <w:rPr>
-                <w:rFonts w:asciiTheme="minorEastAsia" w:eastAsiaTheme="minorEastAsia" w:hAnsiTheme="minorEastAsia" w:cs="Segoe UI"/>
-              </w:rPr>
-              <w:t>고객 인터뷰·대기리스트 확보</w:t>
+                <w:rFonts w:asciiTheme="minorEastAsia" w:eastAsiaTheme="minorEastAsia" w:hAnsiTheme="minorEastAsia" w:cs="Segoe UI" w:hint="eastAsia"/>
+              </w:rPr>
+            </w:pPr>
+            <w:proofErr w:type="spellStart"/>
+            <w:r>
+              <w:rPr>
+                <w:rFonts w:asciiTheme="minorEastAsia" w:eastAsiaTheme="minorEastAsia" w:hAnsiTheme="minorEastAsia" w:cs="Segoe UI" w:hint="eastAsia"/>
+              </w:rPr>
+              <w:t>웹어플리케이션</w:t>
+            </w:r>
+            <w:proofErr w:type="spellEnd"/>
+            <w:r>
+              <w:rPr>
+                <w:rFonts w:asciiTheme="minorEastAsia" w:eastAsiaTheme="minorEastAsia" w:hAnsiTheme="minorEastAsia" w:cs="Segoe UI" w:hint="eastAsia"/>
+              </w:rPr>
+              <w:t xml:space="preserve"> 및 SaaS화</w:t>
             </w:r>
           </w:p>
         </w:tc>
@@ -7689,16 +7988,37 @@
               <w:ind w:left="535" w:right="522"/>
               <w:jc w:val="center"/>
               <w:rPr>
-                <w:rFonts w:asciiTheme="minorEastAsia" w:eastAsiaTheme="minorEastAsia" w:hAnsiTheme="minorEastAsia"/>
-                <w:iCs/>
-              </w:rPr>
-            </w:pPr>
-            <w:r>
-              <w:rPr>
-                <w:rFonts w:asciiTheme="minorEastAsia" w:eastAsiaTheme="minorEastAsia" w:hAnsiTheme="minorEastAsia"/>
-                <w:iCs/>
-              </w:rPr>
-              <w:t>26.06-26.08</w:t>
+                <w:rFonts w:asciiTheme="minorEastAsia" w:eastAsiaTheme="minorEastAsia" w:hAnsiTheme="minorEastAsia" w:hint="eastAsia"/>
+                <w:iCs/>
+              </w:rPr>
+            </w:pPr>
+            <w:r>
+              <w:rPr>
+                <w:rFonts w:asciiTheme="minorEastAsia" w:eastAsiaTheme="minorEastAsia" w:hAnsiTheme="minorEastAsia"/>
+                <w:iCs/>
+              </w:rPr>
+              <w:t>26.0</w:t>
+            </w:r>
+            <w:r>
+              <w:rPr>
+                <w:rFonts w:asciiTheme="minorEastAsia" w:eastAsiaTheme="minorEastAsia" w:hAnsiTheme="minorEastAsia" w:hint="eastAsia"/>
+                <w:iCs/>
+              </w:rPr>
+              <w:t>7</w:t>
+            </w:r>
+            <w:r>
+              <w:rPr>
+                <w:rFonts w:asciiTheme="minorEastAsia" w:eastAsiaTheme="minorEastAsia" w:hAnsiTheme="minorEastAsia"/>
+                <w:iCs/>
+              </w:rPr>
+              <w:t>-26.0</w:t>
+            </w:r>
+            <w:r>
+              <w:rPr>
+                <w:rFonts w:asciiTheme="minorEastAsia" w:eastAsiaTheme="minorEastAsia" w:hAnsiTheme="minorEastAsia" w:hint="eastAsia"/>
+                <w:iCs/>
+              </w:rPr>
+              <w:t>9</w:t>
             </w:r>
           </w:p>
         </w:tc>
@@ -7713,16 +8033,46 @@
               <w:ind w:left="290" w:right="272"/>
               <w:jc w:val="center"/>
               <w:rPr>
-                <w:rFonts w:asciiTheme="minorEastAsia" w:eastAsiaTheme="minorEastAsia" w:hAnsiTheme="minorEastAsia"/>
-                <w:iCs/>
-              </w:rPr>
-            </w:pPr>
-            <w:r>
-              <w:rPr>
-                <w:rFonts w:asciiTheme="minorEastAsia" w:eastAsiaTheme="minorEastAsia" w:hAnsiTheme="minorEastAsia"/>
-                <w:iCs/>
-              </w:rPr>
-              <w:t>인터뷰 15건, 대기리스트 30건</w:t>
+                <w:rFonts w:asciiTheme="minorEastAsia" w:eastAsiaTheme="minorEastAsia" w:hAnsiTheme="minorEastAsia" w:hint="eastAsia"/>
+                <w:iCs/>
+              </w:rPr>
+            </w:pPr>
+            <w:r>
+              <w:rPr>
+                <w:rFonts w:asciiTheme="minorEastAsia" w:eastAsiaTheme="minorEastAsia" w:hAnsiTheme="minorEastAsia" w:hint="eastAsia"/>
+                <w:iCs/>
+              </w:rPr>
+              <w:t>3개 사용 유형과 결제</w:t>
+            </w:r>
+            <w:r>
+              <w:rPr>
+                <w:rFonts w:asciiTheme="minorEastAsia" w:eastAsiaTheme="minorEastAsia" w:hAnsiTheme="minorEastAsia"/>
+                <w:iCs/>
+              </w:rPr>
+              <w:t>·</w:t>
+            </w:r>
+            <w:r>
+              <w:rPr>
+                <w:rFonts w:asciiTheme="minorEastAsia" w:eastAsiaTheme="minorEastAsia" w:hAnsiTheme="minorEastAsia" w:hint="eastAsia"/>
+                <w:iCs/>
+              </w:rPr>
+              <w:t xml:space="preserve">리포트 등 </w:t>
+            </w:r>
+            <w:proofErr w:type="spellStart"/>
+            <w:r>
+              <w:rPr>
+                <w:rFonts w:asciiTheme="minorEastAsia" w:eastAsiaTheme="minorEastAsia" w:hAnsiTheme="minorEastAsia" w:hint="eastAsia"/>
+                <w:iCs/>
+              </w:rPr>
+              <w:t>웹어플리케이션</w:t>
+            </w:r>
+            <w:proofErr w:type="spellEnd"/>
+            <w:r>
+              <w:rPr>
+                <w:rFonts w:asciiTheme="minorEastAsia" w:eastAsiaTheme="minorEastAsia" w:hAnsiTheme="minorEastAsia" w:hint="eastAsia"/>
+                <w:iCs/>
+              </w:rPr>
+              <w:t xml:space="preserve"> 개발</w:t>
             </w:r>
           </w:p>
         </w:tc>
@@ -7764,16 +8114,16 @@
               <w:pStyle w:val="TableParagraph"/>
               <w:jc w:val="center"/>
               <w:rPr>
-                <w:rFonts w:asciiTheme="minorEastAsia" w:eastAsiaTheme="minorEastAsia" w:hAnsiTheme="minorEastAsia"/>
-                <w:iCs/>
-              </w:rPr>
-            </w:pPr>
-            <w:r>
-              <w:rPr>
-                <w:rFonts w:asciiTheme="minorEastAsia" w:eastAsiaTheme="minorEastAsia" w:hAnsiTheme="minorEastAsia"/>
-                <w:iCs/>
-              </w:rPr>
-              <w:t>알파 출시 + 한국 시장 적합성 검증</w:t>
+                <w:rFonts w:asciiTheme="minorEastAsia" w:eastAsiaTheme="minorEastAsia" w:hAnsiTheme="minorEastAsia" w:hint="eastAsia"/>
+                <w:iCs/>
+              </w:rPr>
+            </w:pPr>
+            <w:r>
+              <w:rPr>
+                <w:rFonts w:asciiTheme="minorEastAsia" w:eastAsiaTheme="minorEastAsia" w:hAnsiTheme="minorEastAsia" w:hint="eastAsia"/>
+                <w:iCs/>
+              </w:rPr>
+              <w:t>국내 베타 오픈</w:t>
             </w:r>
           </w:p>
         </w:tc>
@@ -7808,16 +8158,32 @@
               <w:pStyle w:val="TableParagraph"/>
               <w:jc w:val="center"/>
               <w:rPr>
-                <w:rFonts w:asciiTheme="minorEastAsia" w:eastAsiaTheme="minorEastAsia" w:hAnsiTheme="minorEastAsia"/>
-                <w:iCs/>
-              </w:rPr>
-            </w:pPr>
-            <w:r>
-              <w:rPr>
-                <w:rFonts w:asciiTheme="minorEastAsia" w:eastAsiaTheme="minorEastAsia" w:hAnsiTheme="minorEastAsia"/>
-                <w:iCs/>
-              </w:rPr>
-              <w:t>Disquiet·GeekNews, 유료 전환 2-3건</w:t>
+                <w:rFonts w:asciiTheme="minorEastAsia" w:eastAsiaTheme="minorEastAsia" w:hAnsiTheme="minorEastAsia" w:hint="eastAsia"/>
+                <w:iCs/>
+              </w:rPr>
+            </w:pPr>
+            <w:r>
+              <w:rPr>
+                <w:rFonts w:asciiTheme="minorEastAsia" w:eastAsiaTheme="minorEastAsia" w:hAnsiTheme="minorEastAsia" w:hint="eastAsia"/>
+                <w:iCs/>
+              </w:rPr>
+              <w:t xml:space="preserve">국내 </w:t>
+            </w:r>
+            <w:proofErr w:type="spellStart"/>
+            <w:r>
+              <w:rPr>
+                <w:rFonts w:asciiTheme="minorEastAsia" w:eastAsiaTheme="minorEastAsia" w:hAnsiTheme="minorEastAsia" w:hint="eastAsia"/>
+                <w:iCs/>
+              </w:rPr>
+              <w:t>셀프서브</w:t>
+            </w:r>
+            <w:proofErr w:type="spellEnd"/>
+            <w:r>
+              <w:rPr>
+                <w:rFonts w:asciiTheme="minorEastAsia" w:eastAsiaTheme="minorEastAsia" w:hAnsiTheme="minorEastAsia" w:hint="eastAsia"/>
+                <w:iCs/>
+              </w:rPr>
+              <w:t xml:space="preserve"> 운영을 통한 초기 유료 검증</w:t>
             </w:r>
           </w:p>
         </w:tc>
@@ -7863,9 +8229,9 @@
             </w:pPr>
             <w:r>
               <w:rPr>
-                <w:rFonts w:asciiTheme="minorEastAsia" w:eastAsiaTheme="minorEastAsia" w:hAnsiTheme="minorEastAsia" w:cs="Segoe UI"/>
-              </w:rPr>
-              <w:t>베타 출시 + 글로벌 확장</w:t>
+                <w:rFonts w:asciiTheme="minorEastAsia" w:eastAsiaTheme="minorEastAsia" w:hAnsiTheme="minorEastAsia" w:cs="Segoe UI" w:hint="eastAsia"/>
+              </w:rPr>
+              <w:t>베타 안정화 및 글로벌 확장</w:t>
             </w:r>
           </w:p>
         </w:tc>
@@ -7900,24 +8266,29 @@
               <w:pStyle w:val="TableParagraph"/>
               <w:jc w:val="center"/>
               <w:rPr>
-                <w:rFonts w:asciiTheme="minorEastAsia" w:eastAsiaTheme="minorEastAsia" w:hAnsiTheme="minorEastAsia"/>
-                <w:iCs/>
-              </w:rPr>
-            </w:pPr>
-            <w:r>
-              <w:rPr>
-                <w:rFonts w:asciiTheme="minorEastAsia" w:eastAsiaTheme="minorEastAsia" w:hAnsiTheme="minorEastAsia"/>
-                <w:iCs/>
-              </w:rPr>
-              <w:t>Product Hunt·Show HN 출시, 유료 10-20건</w:t>
+                <w:rFonts w:asciiTheme="minorEastAsia" w:eastAsiaTheme="minorEastAsia" w:hAnsiTheme="minorEastAsia" w:hint="eastAsia"/>
+                <w:iCs/>
+              </w:rPr>
+            </w:pPr>
+            <w:r>
+              <w:rPr>
+                <w:rFonts w:asciiTheme="minorEastAsia" w:eastAsiaTheme="minorEastAsia" w:hAnsiTheme="minorEastAsia" w:hint="eastAsia"/>
+                <w:iCs/>
+              </w:rPr>
+              <w:t>베타 운영 안정화, 글로벌 SaaS오픈</w:t>
             </w:r>
           </w:p>
         </w:tc>
       </w:tr>
     </w:tbl>
     <w:p/>
-    <w:p/>
-    <w:p/>
+    <w:p>
+      <w:pPr>
+        <w:rPr>
+          <w:rFonts w:hint="eastAsia"/>
+        </w:rPr>
+      </w:pPr>
+    </w:p>
     <w:p/>
     <w:p>
       <w:pPr>
@@ -8571,8 +8942,16 @@
               <w:rPr>
                 <w:rFonts w:asciiTheme="minorEastAsia" w:eastAsiaTheme="minorEastAsia" w:hAnsiTheme="minorEastAsia"/>
               </w:rPr>
-              <w:t>특허권 등 무형자산 취득비</w:t>
-            </w:r>
+              <w:t xml:space="preserve">특허권 등 무형자산 </w:t>
+            </w:r>
+            <w:proofErr w:type="spellStart"/>
+            <w:r>
+              <w:rPr>
+                <w:rFonts w:asciiTheme="minorEastAsia" w:eastAsiaTheme="minorEastAsia" w:hAnsiTheme="minorEastAsia"/>
+              </w:rPr>
+              <w:t>취득비</w:t>
+            </w:r>
+            <w:proofErr w:type="spellEnd"/>
           </w:p>
         </w:tc>
         <w:tc>
@@ -10554,8 +10933,16 @@
               <w:rPr>
                 <w:rFonts w:asciiTheme="minorEastAsia" w:eastAsiaTheme="minorEastAsia" w:hAnsiTheme="minorEastAsia"/>
               </w:rPr>
-              <w:t>설문 재현만 검증됨, 실제 행동 예측은 미검증</w:t>
-            </w:r>
+              <w:t xml:space="preserve">설문 재현만 검증됨, 실제 행동 예측은 </w:t>
+            </w:r>
+            <w:proofErr w:type="spellStart"/>
+            <w:r>
+              <w:rPr>
+                <w:rFonts w:asciiTheme="minorEastAsia" w:eastAsiaTheme="minorEastAsia" w:hAnsiTheme="minorEastAsia"/>
+              </w:rPr>
+              <w:t>미검증</w:t>
+            </w:r>
+            <w:proofErr w:type="spellEnd"/>
           </w:p>
         </w:tc>
       </w:tr>
@@ -10849,8 +11236,8 @@
       </w:tblPr>
       <w:tblGrid>
         <w:gridCol w:w="1026"/>
-        <w:gridCol w:w="1276"/>
-        <w:gridCol w:w="2551"/>
+        <w:gridCol w:w="1417"/>
+        <w:gridCol w:w="2410"/>
         <w:gridCol w:w="2410"/>
         <w:gridCol w:w="2085"/>
       </w:tblGrid>
@@ -10881,7 +11268,7 @@
         </w:tc>
         <w:tc>
           <w:tcPr>
-            <w:tcW w:w="1276" w:type="dxa"/>
+            <w:tcW w:w="1417" w:type="dxa"/>
             <w:shd w:val="clear" w:color="auto" w:fill="F2F2F2" w:themeFill="background1" w:themeFillShade="F2"/>
           </w:tcPr>
           <w:p>
@@ -10902,7 +11289,7 @@
         </w:tc>
         <w:tc>
           <w:tcPr>
-            <w:tcW w:w="2551" w:type="dxa"/>
+            <w:tcW w:w="2410" w:type="dxa"/>
             <w:shd w:val="clear" w:color="auto" w:fill="F2F2F2" w:themeFill="background1" w:themeFillShade="F2"/>
           </w:tcPr>
           <w:p>
@@ -10990,7 +11377,7 @@
         </w:tc>
         <w:tc>
           <w:tcPr>
-            <w:tcW w:w="1276" w:type="dxa"/>
+            <w:tcW w:w="1417" w:type="dxa"/>
           </w:tcPr>
           <w:p>
             <w:pPr>
@@ -11005,13 +11392,27 @@
                 <w:rFonts w:asciiTheme="minorEastAsia" w:eastAsiaTheme="minorEastAsia" w:hAnsiTheme="minorEastAsia" w:cs="Segoe UI"/>
                 <w:color w:val="4A4A48"/>
               </w:rPr>
-              <w:t>06-08월</w:t>
-            </w:r>
-          </w:p>
-        </w:tc>
-        <w:tc>
-          <w:tcPr>
-            <w:tcW w:w="2551" w:type="dxa"/>
+              <w:t>06-0</w:t>
+            </w:r>
+            <w:r>
+              <w:rPr>
+                <w:rFonts w:asciiTheme="minorEastAsia" w:eastAsiaTheme="minorEastAsia" w:hAnsiTheme="minorEastAsia" w:cs="Segoe UI" w:hint="eastAsia"/>
+                <w:color w:val="4A4A48"/>
+              </w:rPr>
+              <w:t>9</w:t>
+            </w:r>
+            <w:r>
+              <w:rPr>
+                <w:rFonts w:asciiTheme="minorEastAsia" w:eastAsiaTheme="minorEastAsia" w:hAnsiTheme="minorEastAsia" w:cs="Segoe UI"/>
+                <w:color w:val="4A4A48"/>
+              </w:rPr>
+              <w:t>월</w:t>
+            </w:r>
+          </w:p>
+        </w:tc>
+        <w:tc>
+          <w:tcPr>
+            <w:tcW w:w="2410" w:type="dxa"/>
           </w:tcPr>
           <w:p>
             <w:pPr>
@@ -11038,14 +11439,14 @@
               <w:pStyle w:val="a4"/>
               <w:jc w:val="center"/>
               <w:rPr>
-                <w:rFonts w:asciiTheme="minorEastAsia" w:eastAsiaTheme="minorEastAsia" w:hAnsiTheme="minorEastAsia"/>
-              </w:rPr>
-            </w:pPr>
-            <w:r>
-              <w:rPr>
-                <w:rFonts w:asciiTheme="minorEastAsia" w:eastAsiaTheme="minorEastAsia" w:hAnsiTheme="minorEastAsia"/>
-              </w:rPr>
-              <w:t>Disquiet, 랜딩페이지, 고객 인터뷰</w:t>
+                <w:rFonts w:asciiTheme="minorEastAsia" w:eastAsiaTheme="minorEastAsia" w:hAnsiTheme="minorEastAsia" w:hint="eastAsia"/>
+              </w:rPr>
+            </w:pPr>
+            <w:r>
+              <w:rPr>
+                <w:rFonts w:asciiTheme="minorEastAsia" w:eastAsiaTheme="minorEastAsia" w:hAnsiTheme="minorEastAsia" w:hint="eastAsia"/>
+              </w:rPr>
+              <w:t>랜딩페이지, SNS, 메이커로그</w:t>
             </w:r>
           </w:p>
         </w:tc>
@@ -11058,14 +11459,14 @@
               <w:pStyle w:val="a4"/>
               <w:jc w:val="center"/>
               <w:rPr>
-                <w:rFonts w:asciiTheme="minorEastAsia" w:eastAsiaTheme="minorEastAsia" w:hAnsiTheme="minorEastAsia"/>
-              </w:rPr>
-            </w:pPr>
-            <w:r>
-              <w:rPr>
-                <w:rFonts w:asciiTheme="minorEastAsia" w:eastAsiaTheme="minorEastAsia" w:hAnsiTheme="minorEastAsia"/>
-              </w:rPr>
-              <w:t>인터뷰 15건, 대기리스트 30건</w:t>
+                <w:rFonts w:asciiTheme="minorEastAsia" w:eastAsiaTheme="minorEastAsia" w:hAnsiTheme="minorEastAsia" w:hint="eastAsia"/>
+              </w:rPr>
+            </w:pPr>
+            <w:r>
+              <w:rPr>
+                <w:rFonts w:asciiTheme="minorEastAsia" w:eastAsiaTheme="minorEastAsia" w:hAnsiTheme="minorEastAsia" w:hint="eastAsia"/>
+              </w:rPr>
+              <w:t>개발로그 연재, 인터뷰 20건, 대기리스트 150건</w:t>
             </w:r>
           </w:p>
         </w:tc>
@@ -11096,7 +11497,7 @@
         </w:tc>
         <w:tc>
           <w:tcPr>
-            <w:tcW w:w="1276" w:type="dxa"/>
+            <w:tcW w:w="1417" w:type="dxa"/>
           </w:tcPr>
           <w:p>
             <w:pPr>
@@ -11117,7 +11518,7 @@
         </w:tc>
         <w:tc>
           <w:tcPr>
-            <w:tcW w:w="2551" w:type="dxa"/>
+            <w:tcW w:w="2410" w:type="dxa"/>
           </w:tcPr>
           <w:p>
             <w:pPr>
@@ -11173,11 +11574,19 @@
                 <w:rFonts w:asciiTheme="minorEastAsia" w:eastAsiaTheme="minorEastAsia" w:hAnsiTheme="minorEastAsia"/>
               </w:rPr>
             </w:pPr>
-            <w:r>
-              <w:rPr>
-                <w:rFonts w:asciiTheme="minorEastAsia" w:eastAsiaTheme="minorEastAsia" w:hAnsiTheme="minorEastAsia"/>
-              </w:rPr>
-              <w:t>Disquiet·GeekNews, 요즘IT</w:t>
+            <w:proofErr w:type="spellStart"/>
+            <w:r>
+              <w:rPr>
+                <w:rFonts w:asciiTheme="minorEastAsia" w:eastAsiaTheme="minorEastAsia" w:hAnsiTheme="minorEastAsia"/>
+              </w:rPr>
+              <w:t>Disquiet·GeekNews</w:t>
+            </w:r>
+            <w:proofErr w:type="spellEnd"/>
+            <w:r>
+              <w:rPr>
+                <w:rFonts w:asciiTheme="minorEastAsia" w:eastAsiaTheme="minorEastAsia" w:hAnsiTheme="minorEastAsia"/>
+              </w:rPr>
+              <w:t>, 요즘IT</w:t>
             </w:r>
           </w:p>
         </w:tc>
@@ -11190,20 +11599,14 @@
               <w:pStyle w:val="a4"/>
               <w:jc w:val="center"/>
               <w:rPr>
-                <w:rFonts w:asciiTheme="minorEastAsia" w:eastAsiaTheme="minorEastAsia" w:hAnsiTheme="minorEastAsia"/>
-              </w:rPr>
-            </w:pPr>
-            <w:r>
-              <w:rPr>
-                <w:rFonts w:asciiTheme="minorEastAsia" w:eastAsiaTheme="minorEastAsia" w:hAnsiTheme="minorEastAsia" w:hint="eastAsia"/>
-              </w:rPr>
-              <w:t>무료</w:t>
-            </w:r>
-            <w:r>
-              <w:rPr>
-                <w:rFonts w:asciiTheme="minorEastAsia" w:eastAsiaTheme="minorEastAsia" w:hAnsiTheme="minorEastAsia"/>
-              </w:rPr>
-              <w:t xml:space="preserve"> 체험 50건+, 유료 2-3건</w:t>
+                <w:rFonts w:asciiTheme="minorEastAsia" w:eastAsiaTheme="minorEastAsia" w:hAnsiTheme="minorEastAsia" w:hint="eastAsia"/>
+              </w:rPr>
+            </w:pPr>
+            <w:r>
+              <w:rPr>
+                <w:rFonts w:asciiTheme="minorEastAsia" w:eastAsiaTheme="minorEastAsia" w:hAnsiTheme="minorEastAsia" w:hint="eastAsia"/>
+              </w:rPr>
+              <w:t>유료 고객 20-30명</w:t>
             </w:r>
           </w:p>
         </w:tc>
@@ -11234,47 +11637,55 @@
         </w:tc>
         <w:tc>
           <w:tcPr>
-            <w:tcW w:w="1276" w:type="dxa"/>
+            <w:tcW w:w="1417" w:type="dxa"/>
           </w:tcPr>
           <w:p>
             <w:pPr>
               <w:pStyle w:val="a4"/>
               <w:jc w:val="center"/>
               <w:rPr>
-                <w:rFonts w:asciiTheme="minorEastAsia" w:eastAsiaTheme="minorEastAsia" w:hAnsiTheme="minorEastAsia"/>
-              </w:rPr>
-            </w:pPr>
-            <w:r>
-              <w:rPr>
-                <w:rFonts w:asciiTheme="minorEastAsia" w:eastAsiaTheme="minorEastAsia" w:hAnsiTheme="minorEastAsia"/>
-              </w:rPr>
-              <w:t>11-01월</w:t>
-            </w:r>
-          </w:p>
-        </w:tc>
-        <w:tc>
-          <w:tcPr>
-            <w:tcW w:w="2551" w:type="dxa"/>
+                <w:rFonts w:asciiTheme="minorEastAsia" w:eastAsiaTheme="minorEastAsia" w:hAnsiTheme="minorEastAsia" w:hint="eastAsia"/>
+              </w:rPr>
+            </w:pPr>
+            <w:r>
+              <w:rPr>
+                <w:rFonts w:asciiTheme="minorEastAsia" w:eastAsiaTheme="minorEastAsia" w:hAnsiTheme="minorEastAsia" w:hint="eastAsia"/>
+              </w:rPr>
+              <w:t>27년 01-06</w:t>
+            </w:r>
+          </w:p>
+        </w:tc>
+        <w:tc>
+          <w:tcPr>
+            <w:tcW w:w="2410" w:type="dxa"/>
           </w:tcPr>
           <w:p>
             <w:pPr>
               <w:pStyle w:val="a4"/>
               <w:jc w:val="center"/>
               <w:rPr>
-                <w:rFonts w:asciiTheme="minorEastAsia" w:eastAsiaTheme="minorEastAsia" w:hAnsiTheme="minorEastAsia"/>
-              </w:rPr>
-            </w:pPr>
-            <w:r>
-              <w:rPr>
-                <w:rFonts w:asciiTheme="minorEastAsia" w:eastAsiaTheme="minorEastAsia" w:hAnsiTheme="minorEastAsia" w:hint="eastAsia"/>
-              </w:rPr>
-              <w:t>글로</w:t>
-            </w:r>
-            <w:r>
-              <w:rPr>
-                <w:rFonts w:asciiTheme="minorEastAsia" w:eastAsiaTheme="minorEastAsia" w:hAnsiTheme="minorEastAsia" w:hint="eastAsia"/>
-              </w:rPr>
-              <w:t>벌 창업팀</w:t>
+                <w:rFonts w:asciiTheme="minorEastAsia" w:eastAsiaTheme="minorEastAsia" w:hAnsiTheme="minorEastAsia" w:hint="eastAsia"/>
+              </w:rPr>
+            </w:pPr>
+            <w:r>
+              <w:rPr>
+                <w:rFonts w:asciiTheme="minorEastAsia" w:eastAsiaTheme="minorEastAsia" w:hAnsiTheme="minorEastAsia" w:hint="eastAsia"/>
+              </w:rPr>
+              <w:t xml:space="preserve">해외 </w:t>
+            </w:r>
+            <w:proofErr w:type="spellStart"/>
+            <w:r>
+              <w:rPr>
+                <w:rFonts w:asciiTheme="minorEastAsia" w:eastAsiaTheme="minorEastAsia" w:hAnsiTheme="minorEastAsia" w:hint="eastAsia"/>
+              </w:rPr>
+              <w:t>인디해커</w:t>
+            </w:r>
+            <w:proofErr w:type="spellEnd"/>
+            <w:r>
+              <w:rPr>
+                <w:rFonts w:asciiTheme="minorEastAsia" w:eastAsiaTheme="minorEastAsia" w:hAnsiTheme="minorEastAsia" w:hint="eastAsia"/>
+              </w:rPr>
+              <w:t>, 스타트업PM,</w:t>
             </w:r>
           </w:p>
         </w:tc>
@@ -11307,20 +11718,14 @@
               <w:pStyle w:val="a4"/>
               <w:jc w:val="center"/>
               <w:rPr>
-                <w:rFonts w:asciiTheme="minorEastAsia" w:eastAsiaTheme="minorEastAsia" w:hAnsiTheme="minorEastAsia"/>
-              </w:rPr>
-            </w:pPr>
-            <w:r>
-              <w:rPr>
-                <w:rFonts w:asciiTheme="minorEastAsia" w:eastAsiaTheme="minorEastAsia" w:hAnsiTheme="minorEastAsia" w:hint="eastAsia"/>
-              </w:rPr>
-              <w:t>유료</w:t>
-            </w:r>
-            <w:r>
-              <w:rPr>
-                <w:rFonts w:asciiTheme="minorEastAsia" w:eastAsiaTheme="minorEastAsia" w:hAnsiTheme="minorEastAsia"/>
-              </w:rPr>
-              <w:t xml:space="preserve"> 10-20건</w:t>
+                <w:rFonts w:asciiTheme="minorEastAsia" w:eastAsiaTheme="minorEastAsia" w:hAnsiTheme="minorEastAsia" w:hint="eastAsia"/>
+              </w:rPr>
+            </w:pPr>
+            <w:r>
+              <w:rPr>
+                <w:rFonts w:asciiTheme="minorEastAsia" w:eastAsiaTheme="minorEastAsia" w:hAnsiTheme="minorEastAsia" w:hint="eastAsia"/>
+              </w:rPr>
+              <w:t>누적 유료고객 100명 달성</w:t>
             </w:r>
           </w:p>
         </w:tc>
@@ -11452,8 +11857,16 @@
               <w:rPr>
                 <w:rFonts w:asciiTheme="minorEastAsia" w:eastAsiaTheme="minorEastAsia" w:hAnsiTheme="minorEastAsia" w:hint="eastAsia"/>
               </w:rPr>
-              <w:t>합성 서베이</w:t>
-            </w:r>
+              <w:t xml:space="preserve">합성 </w:t>
+            </w:r>
+            <w:proofErr w:type="spellStart"/>
+            <w:r>
+              <w:rPr>
+                <w:rFonts w:asciiTheme="minorEastAsia" w:eastAsiaTheme="minorEastAsia" w:hAnsiTheme="minorEastAsia" w:hint="eastAsia"/>
+              </w:rPr>
+              <w:t>서베이</w:t>
+            </w:r>
+            <w:proofErr w:type="spellEnd"/>
           </w:p>
         </w:tc>
         <w:tc>
@@ -11683,12 +12096,14 @@
                 <w:rFonts w:asciiTheme="minorEastAsia" w:eastAsiaTheme="minorEastAsia" w:hAnsiTheme="minorEastAsia"/>
               </w:rPr>
             </w:pPr>
+            <w:proofErr w:type="spellStart"/>
             <w:r>
               <w:rPr>
                 <w:rFonts w:asciiTheme="minorEastAsia" w:eastAsiaTheme="minorEastAsia" w:hAnsiTheme="minorEastAsia" w:hint="eastAsia"/>
               </w:rPr>
               <w:t>매출총이익률</w:t>
             </w:r>
+            <w:proofErr w:type="spellEnd"/>
           </w:p>
         </w:tc>
         <w:tc>
@@ -11771,6 +12186,7 @@
               <w:rPr>
                 <w:rFonts w:asciiTheme="minorEastAsia" w:eastAsiaTheme="minorEastAsia" w:hAnsiTheme="minorEastAsia" w:hint="eastAsia"/>
               </w:rPr>
+              <w:lastRenderedPageBreak/>
               <w:t>부대비용(결제</w:t>
             </w:r>
             <w:r>
@@ -11872,7 +12288,6 @@
                 <w:b/>
                 <w:bCs/>
               </w:rPr>
-              <w:lastRenderedPageBreak/>
               <w:t>건당 공헌이익</w:t>
             </w:r>
           </w:p>
@@ -12199,15 +12614,13 @@
               <w:jc w:val="center"/>
               <w:rPr>
                 <w:rFonts w:asciiTheme="minorEastAsia" w:eastAsiaTheme="minorEastAsia" w:hAnsiTheme="minorEastAsia" w:cs="Segoe UI"/>
-                <w:color w:val="4A4A48"/>
               </w:rPr>
             </w:pPr>
             <w:r>
               <w:rPr>
                 <w:rFonts w:asciiTheme="minorEastAsia" w:eastAsiaTheme="minorEastAsia" w:hAnsiTheme="minorEastAsia" w:cs="Segoe UI" w:hint="eastAsia"/>
-                <w:color w:val="4A4A48"/>
-              </w:rPr>
-              <w:t>$1K</w:t>
+              </w:rPr>
+              <w:t>$10K</w:t>
             </w:r>
           </w:p>
         </w:tc>
@@ -12227,7 +12640,7 @@
               <w:rPr>
                 <w:rFonts w:asciiTheme="minorEastAsia" w:eastAsiaTheme="minorEastAsia" w:hAnsiTheme="minorEastAsia"/>
               </w:rPr>
-              <w:t>유료 전환 10-20건, 반복 사용 고객 3개사 확보</w:t>
+              <w:t>유료 고객 100명, 반복 사용 고객 15개사 확보</w:t>
             </w:r>
           </w:p>
         </w:tc>
@@ -12265,13 +12678,11 @@
               <w:jc w:val="center"/>
               <w:rPr>
                 <w:rFonts w:asciiTheme="minorEastAsia" w:eastAsiaTheme="minorEastAsia" w:hAnsiTheme="minorEastAsia" w:cs="Segoe UI"/>
-                <w:color w:val="4A4A48"/>
               </w:rPr>
             </w:pPr>
             <w:r>
               <w:rPr>
                 <w:rFonts w:asciiTheme="minorEastAsia" w:eastAsiaTheme="minorEastAsia" w:hAnsiTheme="minorEastAsia" w:cs="Segoe UI"/>
-                <w:color w:val="4A4A48"/>
               </w:rPr>
               <w:t>$240K</w:t>
             </w:r>
@@ -12291,27 +12702,9 @@
             </w:pPr>
             <w:r>
               <w:rPr>
-                <w:rFonts w:asciiTheme="minorEastAsia" w:eastAsiaTheme="minorEastAsia" w:hAnsiTheme="minorEastAsia" w:hint="eastAsia"/>
-              </w:rPr>
-              <w:t>고객</w:t>
-            </w:r>
-            <w:r>
-              <w:rPr>
-                <w:rFonts w:asciiTheme="minorEastAsia" w:eastAsiaTheme="minorEastAsia" w:hAnsiTheme="minorEastAsia"/>
-              </w:rPr>
-              <w:t xml:space="preserve"> 580명,</w:t>
-            </w:r>
-            <w:r>
-              <w:rPr>
-                <w:rFonts w:asciiTheme="minorEastAsia" w:eastAsiaTheme="minorEastAsia" w:hAnsiTheme="minorEastAsia" w:hint="eastAsia"/>
-              </w:rPr>
-              <w:t xml:space="preserve"> </w:t>
-            </w:r>
-            <w:r>
-              <w:rPr>
-                <w:rFonts w:asciiTheme="minorEastAsia" w:eastAsiaTheme="minorEastAsia" w:hAnsiTheme="minorEastAsia"/>
-              </w:rPr>
-              <w:t>글로벌 매출 비중 70-80%</w:t>
+                <w:rFonts w:asciiTheme="minorEastAsia" w:eastAsiaTheme="minorEastAsia" w:hAnsiTheme="minorEastAsia"/>
+              </w:rPr>
+              <w:t>고객 580명, 글로벌 매출 비중 70-80%</w:t>
             </w:r>
           </w:p>
         </w:tc>
@@ -12376,31 +12769,7 @@
               <w:rPr>
                 <w:rFonts w:asciiTheme="minorEastAsia" w:eastAsiaTheme="minorEastAsia" w:hAnsiTheme="minorEastAsia"/>
               </w:rPr>
-              <w:t>고객 7,000명,</w:t>
-            </w:r>
-            <w:r>
-              <w:rPr>
-                <w:rFonts w:asciiTheme="minorEastAsia" w:eastAsiaTheme="minorEastAsia" w:hAnsiTheme="minorEastAsia" w:hint="eastAsia"/>
-              </w:rPr>
-              <w:t xml:space="preserve"> 기업형 </w:t>
-            </w:r>
-            <w:r>
-              <w:rPr>
-                <w:rFonts w:asciiTheme="minorEastAsia" w:eastAsiaTheme="minorEastAsia" w:hAnsiTheme="minorEastAsia"/>
-              </w:rPr>
-              <w:t>에이전시</w:t>
-            </w:r>
-            <w:r>
-              <w:rPr>
-                <w:rFonts w:asciiTheme="minorEastAsia" w:eastAsiaTheme="minorEastAsia" w:hAnsiTheme="minorEastAsia" w:hint="eastAsia"/>
-              </w:rPr>
-              <w:t xml:space="preserve"> 고객 확보</w:t>
-            </w:r>
-            <w:r>
-              <w:rPr>
-                <w:rFonts w:asciiTheme="minorEastAsia" w:eastAsiaTheme="minorEastAsia" w:hAnsiTheme="minorEastAsia"/>
-              </w:rPr>
-              <w:t>, SOM 달성</w:t>
+              <w:t>고객 7,000명, 기업형 에이전시 고객 확보, SOM 달성</w:t>
             </w:r>
           </w:p>
         </w:tc>
@@ -12463,15 +12832,9 @@
             </w:pPr>
             <w:r>
               <w:rPr>
-                <w:rFonts w:asciiTheme="minorEastAsia" w:eastAsiaTheme="minorEastAsia" w:hAnsiTheme="minorEastAsia" w:hint="eastAsia"/>
-              </w:rPr>
-              <w:t>리서치 서비스 영역 진입</w:t>
-            </w:r>
-            <w:r>
-              <w:rPr>
-                <w:rFonts w:asciiTheme="minorEastAsia" w:eastAsiaTheme="minorEastAsia" w:hAnsiTheme="minorEastAsia"/>
-              </w:rPr>
-              <w:t>, SOM 초과</w:t>
+                <w:rFonts w:asciiTheme="minorEastAsia" w:eastAsiaTheme="minorEastAsia" w:hAnsiTheme="minorEastAsia"/>
+              </w:rPr>
+              <w:t>리서치 서비스 영역 진입, SOM 초과</w:t>
             </w:r>
           </w:p>
         </w:tc>
@@ -13073,7 +13436,23 @@
                 <w:rFonts w:asciiTheme="minorEastAsia" w:eastAsiaTheme="minorEastAsia" w:hAnsiTheme="minorEastAsia"/>
                 <w:iCs/>
               </w:rPr>
-              <w:t>Product Hunt·Show HN</w:t>
+              <w:t xml:space="preserve">Product </w:t>
+            </w:r>
+            <w:proofErr w:type="spellStart"/>
+            <w:r>
+              <w:rPr>
+                <w:rFonts w:asciiTheme="minorEastAsia" w:eastAsiaTheme="minorEastAsia" w:hAnsiTheme="minorEastAsia"/>
+                <w:iCs/>
+              </w:rPr>
+              <w:t>Hunt·Show</w:t>
+            </w:r>
+            <w:proofErr w:type="spellEnd"/>
+            <w:r>
+              <w:rPr>
+                <w:rFonts w:asciiTheme="minorEastAsia" w:eastAsiaTheme="minorEastAsia" w:hAnsiTheme="minorEastAsia"/>
+                <w:iCs/>
+              </w:rPr>
+              <w:t xml:space="preserve"> HN</w:t>
             </w:r>
             <w:r>
               <w:rPr>
@@ -13135,12 +13514,21 @@
                 <w:iCs/>
               </w:rPr>
             </w:pPr>
-            <w:r>
-              <w:rPr>
-                <w:rFonts w:asciiTheme="minorEastAsia" w:eastAsiaTheme="minorEastAsia" w:hAnsiTheme="minorEastAsia"/>
-                <w:iCs/>
-              </w:rPr>
-              <w:t>시드 투자 + 팀 확장</w:t>
+            <w:proofErr w:type="spellStart"/>
+            <w:r>
+              <w:rPr>
+                <w:rFonts w:asciiTheme="minorEastAsia" w:eastAsiaTheme="minorEastAsia" w:hAnsiTheme="minorEastAsia"/>
+                <w:iCs/>
+              </w:rPr>
+              <w:t>시드</w:t>
+            </w:r>
+            <w:proofErr w:type="spellEnd"/>
+            <w:r>
+              <w:rPr>
+                <w:rFonts w:asciiTheme="minorEastAsia" w:eastAsiaTheme="minorEastAsia" w:hAnsiTheme="minorEastAsia"/>
+                <w:iCs/>
+              </w:rPr>
+              <w:t xml:space="preserve"> 투자 + 팀 확장</w:t>
             </w:r>
           </w:p>
         </w:tc>
@@ -13406,7 +13794,21 @@
         <w:rPr>
           <w:rFonts w:asciiTheme="minorEastAsia" w:eastAsiaTheme="minorEastAsia" w:hAnsiTheme="minorEastAsia"/>
         </w:rPr>
-        <w:t>반기에 시드 투자</w:t>
+        <w:t xml:space="preserve">반기에 </w:t>
+      </w:r>
+      <w:proofErr w:type="spellStart"/>
+      <w:r>
+        <w:rPr>
+          <w:rFonts w:asciiTheme="minorEastAsia" w:eastAsiaTheme="minorEastAsia" w:hAnsiTheme="minorEastAsia"/>
+        </w:rPr>
+        <w:t>시드</w:t>
+      </w:r>
+      <w:proofErr w:type="spellEnd"/>
+      <w:r>
+        <w:rPr>
+          <w:rFonts w:asciiTheme="minorEastAsia" w:eastAsiaTheme="minorEastAsia" w:hAnsiTheme="minorEastAsia"/>
+        </w:rPr>
+        <w:t xml:space="preserve"> 투자</w:t>
       </w:r>
       <w:r>
         <w:rPr>
@@ -13504,23 +13906,6 @@
         </w:rPr>
         <w:t>: 모든 의사결정 과정과 실험 결과를 문서화하여 공유하고, 팀원 간 수평적 소통 구조를 유지하겠다.</w:t>
       </w:r>
-    </w:p>
-    <w:p/>
-    <w:p/>
-    <w:p>
-      <w:pPr>
-        <w:jc w:val="center"/>
-        <w:rPr>
-          <w:rFonts w:ascii="함초롬돋움"/>
-          <w:sz w:val="20"/>
-        </w:rPr>
-        <w:sectPr>
-          <w:pgSz w:w="11900" w:h="16820"/>
-          <w:pgMar w:top="1701" w:right="1134" w:bottom="1701" w:left="1134" w:header="720" w:footer="720" w:gutter="0"/>
-          <w:cols w:space="720"/>
-          <w:docGrid w:linePitch="360"/>
-        </w:sectPr>
-      </w:pPr>
     </w:p>
     <w:p>
       <w:pPr>
@@ -14129,7 +14514,25 @@
                 <w:sz w:val="16"/>
                 <w:szCs w:val="16"/>
               </w:rPr>
-              <w:t xml:space="preserve">부문 최우수 리더상(2026), </w:t>
+              <w:t xml:space="preserve">부문 최우수 </w:t>
+            </w:r>
+            <w:proofErr w:type="spellStart"/>
+            <w:r>
+              <w:rPr>
+                <w:rFonts w:asciiTheme="minorEastAsia" w:eastAsiaTheme="minorEastAsia" w:hAnsiTheme="minorEastAsia" w:cs="굴림" w:hint="eastAsia"/>
+                <w:sz w:val="16"/>
+                <w:szCs w:val="16"/>
+              </w:rPr>
+              <w:t>리더상</w:t>
+            </w:r>
+            <w:proofErr w:type="spellEnd"/>
+            <w:r>
+              <w:rPr>
+                <w:rFonts w:asciiTheme="minorEastAsia" w:eastAsiaTheme="minorEastAsia" w:hAnsiTheme="minorEastAsia" w:cs="굴림" w:hint="eastAsia"/>
+                <w:sz w:val="16"/>
+                <w:szCs w:val="16"/>
+              </w:rPr>
+              <w:t xml:space="preserve">(2026), </w:t>
             </w:r>
             <w:r>
               <w:rPr>
@@ -14169,7 +14572,25 @@
                 <w:sz w:val="16"/>
                 <w:szCs w:val="16"/>
               </w:rPr>
-              <w:t>—"감성 AI 아바타" 팀장 (2023), ○○해커톤 대상 (2018),</w:t>
+              <w:t>—"감성 AI 아바타" 팀장 (2023), ○○</w:t>
+            </w:r>
+            <w:proofErr w:type="spellStart"/>
+            <w:r>
+              <w:rPr>
+                <w:rFonts w:asciiTheme="minorEastAsia" w:eastAsiaTheme="minorEastAsia" w:hAnsiTheme="minorEastAsia" w:cs="굴림"/>
+                <w:sz w:val="16"/>
+                <w:szCs w:val="16"/>
+              </w:rPr>
+              <w:t>해커톤</w:t>
+            </w:r>
+            <w:proofErr w:type="spellEnd"/>
+            <w:r>
+              <w:rPr>
+                <w:rFonts w:asciiTheme="minorEastAsia" w:eastAsiaTheme="minorEastAsia" w:hAnsiTheme="minorEastAsia" w:cs="굴림"/>
+                <w:sz w:val="16"/>
+                <w:szCs w:val="16"/>
+              </w:rPr>
+              <w:t xml:space="preserve"> 대상 (2018),</w:t>
             </w:r>
           </w:p>
         </w:tc>
@@ -14595,14 +15016,36 @@
               <w:rPr>
                 <w:rFonts w:asciiTheme="minorEastAsia" w:eastAsiaTheme="minorEastAsia" w:hAnsiTheme="minorEastAsia"/>
               </w:rPr>
-              <w:t xml:space="preserve"> 챗봇,</w:t>
-            </w:r>
-            <w:r>
-              <w:rPr>
-                <w:rFonts w:asciiTheme="minorEastAsia" w:eastAsiaTheme="minorEastAsia" w:hAnsiTheme="minorEastAsia" w:hint="eastAsia"/>
-              </w:rPr>
-              <w:t xml:space="preserve"> 상담사 어시스턴트 챗봇</w:t>
-            </w:r>
+              <w:t xml:space="preserve"> </w:t>
+            </w:r>
+            <w:proofErr w:type="spellStart"/>
+            <w:r>
+              <w:rPr>
+                <w:rFonts w:asciiTheme="minorEastAsia" w:eastAsiaTheme="minorEastAsia" w:hAnsiTheme="minorEastAsia"/>
+              </w:rPr>
+              <w:t>챗봇</w:t>
+            </w:r>
+            <w:proofErr w:type="spellEnd"/>
+            <w:r>
+              <w:rPr>
+                <w:rFonts w:asciiTheme="minorEastAsia" w:eastAsiaTheme="minorEastAsia" w:hAnsiTheme="minorEastAsia"/>
+              </w:rPr>
+              <w:t>,</w:t>
+            </w:r>
+            <w:r>
+              <w:rPr>
+                <w:rFonts w:asciiTheme="minorEastAsia" w:eastAsiaTheme="minorEastAsia" w:hAnsiTheme="minorEastAsia" w:hint="eastAsia"/>
+              </w:rPr>
+              <w:t xml:space="preserve"> 상담사 어시스턴트 </w:t>
+            </w:r>
+            <w:proofErr w:type="spellStart"/>
+            <w:r>
+              <w:rPr>
+                <w:rFonts w:asciiTheme="minorEastAsia" w:eastAsiaTheme="minorEastAsia" w:hAnsiTheme="minorEastAsia" w:hint="eastAsia"/>
+              </w:rPr>
+              <w:t>챗봇</w:t>
+            </w:r>
+            <w:proofErr w:type="spellEnd"/>
           </w:p>
         </w:tc>
       </w:tr>
@@ -14684,8 +15127,16 @@
               <w:rPr>
                 <w:rFonts w:asciiTheme="minorEastAsia" w:eastAsiaTheme="minorEastAsia" w:hAnsiTheme="minorEastAsia"/>
               </w:rPr>
-              <w:t>장보기 챗봇</w:t>
-            </w:r>
+              <w:t xml:space="preserve">장보기 </w:t>
+            </w:r>
+            <w:proofErr w:type="spellStart"/>
+            <w:r>
+              <w:rPr>
+                <w:rFonts w:asciiTheme="minorEastAsia" w:eastAsiaTheme="minorEastAsia" w:hAnsiTheme="minorEastAsia"/>
+              </w:rPr>
+              <w:t>챗봇</w:t>
+            </w:r>
+            <w:proofErr w:type="spellEnd"/>
           </w:p>
         </w:tc>
       </w:tr>
@@ -14725,11 +15176,19 @@
                 <w:rFonts w:asciiTheme="minorEastAsia" w:eastAsiaTheme="minorEastAsia" w:hAnsiTheme="minorEastAsia"/>
               </w:rPr>
             </w:pPr>
-            <w:r>
-              <w:rPr>
-                <w:rFonts w:asciiTheme="minorEastAsia" w:eastAsiaTheme="minorEastAsia" w:hAnsiTheme="minorEastAsia" w:hint="eastAsia"/>
-              </w:rPr>
-              <w:t>풀스택 개발</w:t>
+            <w:proofErr w:type="spellStart"/>
+            <w:r>
+              <w:rPr>
+                <w:rFonts w:asciiTheme="minorEastAsia" w:eastAsiaTheme="minorEastAsia" w:hAnsiTheme="minorEastAsia" w:hint="eastAsia"/>
+              </w:rPr>
+              <w:t>풀스택</w:t>
+            </w:r>
+            <w:proofErr w:type="spellEnd"/>
+            <w:r>
+              <w:rPr>
+                <w:rFonts w:asciiTheme="minorEastAsia" w:eastAsiaTheme="minorEastAsia" w:hAnsiTheme="minorEastAsia" w:hint="eastAsia"/>
+              </w:rPr>
+              <w:t xml:space="preserve"> 개발</w:t>
             </w:r>
           </w:p>
         </w:tc>
@@ -14749,7 +15208,21 @@
               <w:rPr>
                 <w:rFonts w:asciiTheme="minorEastAsia" w:eastAsiaTheme="minorEastAsia" w:hAnsiTheme="minorEastAsia"/>
               </w:rPr>
-              <w:t>금융권 CRM 패키지 풀스택 개발·운영</w:t>
+              <w:t xml:space="preserve">금융권 CRM 패키지 </w:t>
+            </w:r>
+            <w:proofErr w:type="spellStart"/>
+            <w:r>
+              <w:rPr>
+                <w:rFonts w:asciiTheme="minorEastAsia" w:eastAsiaTheme="minorEastAsia" w:hAnsiTheme="minorEastAsia"/>
+              </w:rPr>
+              <w:t>풀스택</w:t>
+            </w:r>
+            <w:proofErr w:type="spellEnd"/>
+            <w:r>
+              <w:rPr>
+                <w:rFonts w:asciiTheme="minorEastAsia" w:eastAsiaTheme="minorEastAsia" w:hAnsiTheme="minorEastAsia"/>
+              </w:rPr>
+              <w:t xml:space="preserve"> 개발·운영</w:t>
             </w:r>
           </w:p>
         </w:tc>
@@ -15314,7 +15787,7 @@
               <w:ind w:left="410" w:right="393"/>
               <w:jc w:val="center"/>
               <w:rPr>
-                <w:rFonts w:asciiTheme="majorEastAsia" w:eastAsiaTheme="majorEastAsia" w:hAnsiTheme="majorEastAsia" w:hint="eastAsia"/>
+                <w:rFonts w:asciiTheme="majorEastAsia" w:eastAsiaTheme="majorEastAsia" w:hAnsiTheme="majorEastAsia"/>
                 <w:iCs/>
                 <w:sz w:val="20"/>
                 <w:szCs w:val="20"/>
@@ -15502,7 +15975,27 @@
                 <w:sz w:val="20"/>
                 <w:szCs w:val="20"/>
               </w:rPr>
-              <w:t>프론트·백엔드 개발, 리포트 UI, 서비스 기능 구현</w:t>
+              <w:t>프론트·</w:t>
+            </w:r>
+            <w:proofErr w:type="spellStart"/>
+            <w:r>
+              <w:rPr>
+                <w:rFonts w:asciiTheme="majorEastAsia" w:eastAsiaTheme="majorEastAsia" w:hAnsiTheme="majorEastAsia"/>
+                <w:iCs/>
+                <w:sz w:val="20"/>
+                <w:szCs w:val="20"/>
+              </w:rPr>
+              <w:t>백엔드</w:t>
+            </w:r>
+            <w:proofErr w:type="spellEnd"/>
+            <w:r>
+              <w:rPr>
+                <w:rFonts w:asciiTheme="majorEastAsia" w:eastAsiaTheme="majorEastAsia" w:hAnsiTheme="majorEastAsia"/>
+                <w:iCs/>
+                <w:sz w:val="20"/>
+                <w:szCs w:val="20"/>
+              </w:rPr>
+              <w:t xml:space="preserve"> 개발, 리포트 UI, 서비스 기능 구현</w:t>
             </w:r>
           </w:p>
         </w:tc>
@@ -15530,7 +16023,27 @@
                 <w:sz w:val="20"/>
                 <w:szCs w:val="20"/>
               </w:rPr>
-              <w:t>웹 서비스 풀스택 개발 경력 5년</w:t>
+              <w:t xml:space="preserve">웹 서비스 </w:t>
+            </w:r>
+            <w:proofErr w:type="spellStart"/>
+            <w:r>
+              <w:rPr>
+                <w:rFonts w:asciiTheme="majorEastAsia" w:eastAsiaTheme="majorEastAsia" w:hAnsiTheme="majorEastAsia"/>
+                <w:iCs/>
+                <w:sz w:val="20"/>
+                <w:szCs w:val="20"/>
+              </w:rPr>
+              <w:t>풀스택</w:t>
+            </w:r>
+            <w:proofErr w:type="spellEnd"/>
+            <w:r>
+              <w:rPr>
+                <w:rFonts w:asciiTheme="majorEastAsia" w:eastAsiaTheme="majorEastAsia" w:hAnsiTheme="majorEastAsia"/>
+                <w:iCs/>
+                <w:sz w:val="20"/>
+                <w:szCs w:val="20"/>
+              </w:rPr>
+              <w:t xml:space="preserve"> 개발 경력 5년</w:t>
             </w:r>
           </w:p>
         </w:tc>

</xml_diff>